<commit_message>
Rename tube laser series to TubeCut Double Chuck / TubeCut Triple Chuck branding
</commit_message>
<xml_diff>
--- a/documentation/datasheets/Wavlon_Tube_Laser_Series_Reference.docx
+++ b/documentation/datasheets/Wavlon_Tube_Laser_Series_Reference.docx
@@ -31,7 +31,7 @@
           <w:sz w:val="32"/>
           <w:szCs w:val="32"/>
         </w:rPr>
-        <w:t xml:space="preserve">Fiber Laser Tube Cutting — Full Series Reference</w:t>
+        <w:t xml:space="preserve">TubeCut — Fiber Laser Tube Cutting Full Series Reference</w:t>
       </w:r>
     </w:p>
     <w:p>
@@ -45,7 +45,7 @@
           <w:sz w:val="22"/>
           <w:szCs w:val="22"/>
         </w:rPr>
-        <w:t xml:space="preserve">WV-T2 (Double Chuck) &amp; WV-T3 (Triple Chuck Heavy Duty) Model Lineup</w:t>
+        <w:t xml:space="preserve">TubeCut Double Chuck &amp; TubeCut Triple Chuck (Heavy Duty) Model Lineup</w:t>
       </w:r>
     </w:p>
     <w:p>
@@ -109,7 +109,7 @@
         <w:spacing w:after="160"/>
       </w:pPr>
       <w:r>
-        <w:t xml:space="preserve">This document defines Wavlon Lasers' full fiber laser tube/pipe cutting line-up, organized into two chuck-count families and four market tiers: Entry, Intermediate, and Heavy Duty. The line-up is engineered with reference to LD Laser's 2026 T5 (double-chuck) and T8 (triple-chuck) catalog series, which were used as the technical and structural benchmark.</w:t>
+        <w:t xml:space="preserve">This document defines Wavlon Lasers' full fiber laser tube/pipe cutting line-up — branded TubeCut, consistent with the PowerCut / ProCut / UltraCut sheet-cutting naming family — organized into two chuck-count series and four market tiers: Entry, Intermediate, and Heavy Duty. The line-up is engineered with reference to LD Laser's 2026 T5 (double-chuck) and T8 (triple-chuck) catalog series, which were used as the technical and structural benchmark.</w:t>
       </w:r>
     </w:p>
     <w:p>
@@ -122,7 +122,7 @@
     </w:p>
     <w:tbl>
       <w:tblPr>
-        <w:tblW w:type="dxa" w:w="10080"/>
+        <w:tblW w:type="dxa" w:w="10280"/>
         <w:tblBorders>
           <w:top w:val="single" w:color="auto" w:sz="4"/>
           <w:left w:val="single" w:color="auto" w:sz="4"/>
@@ -133,17 +133,17 @@
         </w:tblBorders>
       </w:tblPr>
       <w:tblGrid>
-        <w:gridCol w:w="1600"/>
-        <w:gridCol w:w="1600"/>
         <w:gridCol w:w="2200"/>
-        <w:gridCol w:w="1700"/>
+        <w:gridCol w:w="1400"/>
+        <w:gridCol w:w="2200"/>
+        <w:gridCol w:w="1500"/>
         <w:gridCol w:w="1900"/>
         <w:gridCol w:w="1080"/>
       </w:tblGrid>
       <w:tr>
         <w:tc>
           <w:tcPr>
-            <w:tcW w:type="dxa" w:w="1600"/>
+            <w:tcW w:type="dxa" w:w="2200"/>
             <w:tcBorders>
               <w:top w:val="single" w:color="CCCCCC" w:sz="2"/>
               <w:left w:val="single" w:color="CCCCCC" w:sz="2"/>
@@ -177,7 +177,7 @@
         </w:tc>
         <w:tc>
           <w:tcPr>
-            <w:tcW w:type="dxa" w:w="1600"/>
+            <w:tcW w:type="dxa" w:w="1400"/>
             <w:tcBorders>
               <w:top w:val="single" w:color="CCCCCC" w:sz="2"/>
               <w:left w:val="single" w:color="CCCCCC" w:sz="2"/>
@@ -245,7 +245,7 @@
         </w:tc>
         <w:tc>
           <w:tcPr>
-            <w:tcW w:type="dxa" w:w="1700"/>
+            <w:tcW w:type="dxa" w:w="1500"/>
             <w:tcBorders>
               <w:top w:val="single" w:color="CCCCCC" w:sz="2"/>
               <w:left w:val="single" w:color="CCCCCC" w:sz="2"/>
@@ -349,40 +349,40 @@
       <w:tr>
         <w:tc>
           <w:tcPr>
-            <w:tcW w:type="dxa" w:w="1600"/>
-            <w:tcBorders>
-              <w:top w:val="single" w:color="CCCCCC" w:sz="2"/>
-              <w:left w:val="single" w:color="CCCCCC" w:sz="2"/>
-              <w:bottom w:val="single" w:color="CCCCCC" w:sz="2"/>
-              <w:right w:val="single" w:color="CCCCCC" w:sz="2"/>
-            </w:tcBorders>
-            <w:tcMar>
-              <w:top w:type="dxa" w:w="70"/>
-              <w:left w:type="dxa" w:w="110"/>
-              <w:bottom w:type="dxa" w:w="70"/>
-              <w:right w:type="dxa" w:w="110"/>
-            </w:tcMar>
-            <w:vAlign w:val="center"/>
-          </w:tcPr>
-          <w:p>
-            <w:pPr>
-              <w:jc w:val="left"/>
-            </w:pPr>
-            <w:r>
-              <w:rPr>
-                <w:b w:val="false"/>
-                <w:bCs w:val="false"/>
-                <w:color w:val="1A1A2E"/>
-                <w:sz w:val="20"/>
-                <w:szCs w:val="20"/>
-              </w:rPr>
-              <w:t xml:space="preserve">WV-T2</w:t>
-            </w:r>
-          </w:p>
-        </w:tc>
-        <w:tc>
-          <w:tcPr>
-            <w:tcW w:type="dxa" w:w="1600"/>
+            <w:tcW w:type="dxa" w:w="2200"/>
+            <w:tcBorders>
+              <w:top w:val="single" w:color="CCCCCC" w:sz="2"/>
+              <w:left w:val="single" w:color="CCCCCC" w:sz="2"/>
+              <w:bottom w:val="single" w:color="CCCCCC" w:sz="2"/>
+              <w:right w:val="single" w:color="CCCCCC" w:sz="2"/>
+            </w:tcBorders>
+            <w:tcMar>
+              <w:top w:type="dxa" w:w="70"/>
+              <w:left w:type="dxa" w:w="110"/>
+              <w:bottom w:type="dxa" w:w="70"/>
+              <w:right w:type="dxa" w:w="110"/>
+            </w:tcMar>
+            <w:vAlign w:val="center"/>
+          </w:tcPr>
+          <w:p>
+            <w:pPr>
+              <w:jc w:val="left"/>
+            </w:pPr>
+            <w:r>
+              <w:rPr>
+                <w:b w:val="false"/>
+                <w:bCs w:val="false"/>
+                <w:color w:val="1A1A2E"/>
+                <w:sz w:val="20"/>
+                <w:szCs w:val="20"/>
+              </w:rPr>
+              <w:t xml:space="preserve">TubeCut Double Chuck</w:t>
+            </w:r>
+          </w:p>
+        </w:tc>
+        <w:tc>
+          <w:tcPr>
+            <w:tcW w:type="dxa" w:w="1400"/>
             <w:tcBorders>
               <w:top w:val="single" w:color="CCCCCC" w:sz="2"/>
               <w:left w:val="single" w:color="CCCCCC" w:sz="2"/>
@@ -448,7 +448,7 @@
         </w:tc>
         <w:tc>
           <w:tcPr>
-            <w:tcW w:type="dxa" w:w="1700"/>
+            <w:tcW w:type="dxa" w:w="1500"/>
             <w:tcBorders>
               <w:top w:val="single" w:color="CCCCCC" w:sz="2"/>
               <w:left w:val="single" w:color="CCCCCC" w:sz="2"/>
@@ -549,41 +549,41 @@
       <w:tr>
         <w:tc>
           <w:tcPr>
-            <w:tcW w:type="dxa" w:w="1600"/>
-            <w:tcBorders>
-              <w:top w:val="single" w:color="CCCCCC" w:sz="2"/>
-              <w:left w:val="single" w:color="CCCCCC" w:sz="2"/>
-              <w:bottom w:val="single" w:color="CCCCCC" w:sz="2"/>
-              <w:right w:val="single" w:color="CCCCCC" w:sz="2"/>
-            </w:tcBorders>
-            <w:shd w:fill="F8F9FA" w:val="clear"/>
-            <w:tcMar>
-              <w:top w:type="dxa" w:w="70"/>
-              <w:left w:type="dxa" w:w="110"/>
-              <w:bottom w:type="dxa" w:w="70"/>
-              <w:right w:type="dxa" w:w="110"/>
-            </w:tcMar>
-            <w:vAlign w:val="center"/>
-          </w:tcPr>
-          <w:p>
-            <w:pPr>
-              <w:jc w:val="left"/>
-            </w:pPr>
-            <w:r>
-              <w:rPr>
-                <w:b w:val="false"/>
-                <w:bCs w:val="false"/>
-                <w:color w:val="1A1A2E"/>
-                <w:sz w:val="20"/>
-                <w:szCs w:val="20"/>
-              </w:rPr>
-              <w:t xml:space="preserve">WV-T3</w:t>
-            </w:r>
-          </w:p>
-        </w:tc>
-        <w:tc>
-          <w:tcPr>
-            <w:tcW w:type="dxa" w:w="1600"/>
+            <w:tcW w:type="dxa" w:w="2200"/>
+            <w:tcBorders>
+              <w:top w:val="single" w:color="CCCCCC" w:sz="2"/>
+              <w:left w:val="single" w:color="CCCCCC" w:sz="2"/>
+              <w:bottom w:val="single" w:color="CCCCCC" w:sz="2"/>
+              <w:right w:val="single" w:color="CCCCCC" w:sz="2"/>
+            </w:tcBorders>
+            <w:shd w:fill="F8F9FA" w:val="clear"/>
+            <w:tcMar>
+              <w:top w:type="dxa" w:w="70"/>
+              <w:left w:type="dxa" w:w="110"/>
+              <w:bottom w:type="dxa" w:w="70"/>
+              <w:right w:type="dxa" w:w="110"/>
+            </w:tcMar>
+            <w:vAlign w:val="center"/>
+          </w:tcPr>
+          <w:p>
+            <w:pPr>
+              <w:jc w:val="left"/>
+            </w:pPr>
+            <w:r>
+              <w:rPr>
+                <w:b w:val="false"/>
+                <w:bCs w:val="false"/>
+                <w:color w:val="1A1A2E"/>
+                <w:sz w:val="20"/>
+                <w:szCs w:val="20"/>
+              </w:rPr>
+              <w:t xml:space="preserve">TubeCut Triple Chuck</w:t>
+            </w:r>
+          </w:p>
+        </w:tc>
+        <w:tc>
+          <w:tcPr>
+            <w:tcW w:type="dxa" w:w="1400"/>
             <w:tcBorders>
               <w:top w:val="single" w:color="CCCCCC" w:sz="2"/>
               <w:left w:val="single" w:color="CCCCCC" w:sz="2"/>
@@ -651,7 +651,7 @@
         </w:tc>
         <w:tc>
           <w:tcPr>
-            <w:tcW w:type="dxa" w:w="1700"/>
+            <w:tcW w:type="dxa" w:w="1500"/>
             <w:tcBorders>
               <w:top w:val="single" w:color="CCCCCC" w:sz="2"/>
               <w:left w:val="single" w:color="CCCCCC" w:sz="2"/>
@@ -765,7 +765,7 @@
           <w:sz w:val="19"/>
           <w:szCs w:val="19"/>
         </w:rPr>
-        <w:t xml:space="preserve">Note: square-tube capacity is generally equal to round-tube capacity per model, except the top WV-T3-680 tier, where the square-chuck maximum is 570mm (vs. 680mm round) due to chuck-jaw stroke geometry.</w:t>
+        <w:t xml:space="preserve">Note: square-tube capacity is generally equal to round-tube capacity per model, except the top TTC-680 tier, where the square-chuck maximum is 570mm (vs. 680mm round) due to chuck-jaw stroke geometry.</w:t>
       </w:r>
     </w:p>
     <w:p>
@@ -785,7 +785,7 @@
           <w:b/>
           <w:bCs/>
         </w:rPr>
-        <w:t xml:space="preserve">Wavlon tube laser models follow the pattern:</w:t>
+        <w:t xml:space="preserve">Wavlon TubeCut models follow the pattern:</w:t>
       </w:r>
     </w:p>
     <w:p>
@@ -801,7 +801,7 @@
           <w:sz w:val="24"/>
           <w:szCs w:val="24"/>
         </w:rPr>
-        <w:t xml:space="preserve">WV-T[Chuck Count]-[Max Diameter mm]-[Power W]</w:t>
+        <w:t xml:space="preserve">T[DC/TC]-[Max Diameter mm]-[Power W]</w:t>
       </w:r>
     </w:p>
     <w:p>
@@ -814,7 +814,7 @@
         <w:spacing w:after="80"/>
       </w:pPr>
       <w:r>
-        <w:t xml:space="preserve">WV — Wavlon Lasers brand prefix (consistent with existing WV-T6000 single-tier listing)</w:t>
+        <w:t xml:space="preserve">TubeCut — Wavlon's fiber laser tube/pipe cutting brand, alongside PowerCut, ProCut, and UltraCut on the sheet-cutting side</w:t>
       </w:r>
     </w:p>
     <w:p>
@@ -827,7 +827,7 @@
         <w:spacing w:after="80"/>
       </w:pPr>
       <w:r>
-        <w:t xml:space="preserve">T — Tube / pipe cutting category</w:t>
+        <w:t xml:space="preserve">DC — Double Chuck series (Entry &amp; Intermediate tiers)</w:t>
       </w:r>
     </w:p>
     <w:p>
@@ -840,7 +840,7 @@
         <w:spacing w:after="80"/>
       </w:pPr>
       <w:r>
-        <w:t xml:space="preserve">[Chuck Count] — 2 (double chuck) or 3 (triple chuck heavy duty)</w:t>
+        <w:t xml:space="preserve">TC — Triple Chuck series (Heavy Duty tier)</w:t>
       </w:r>
     </w:p>
     <w:p>
@@ -866,7 +866,7 @@
         <w:spacing w:after="80"/>
       </w:pPr>
       <w:r>
-        <w:t xml:space="preserve">[Power W] — laser source power in watts, e.g. 4000 = 4kW (omitted when referring to a diameter tier generically, e.g. “WV-T2-160”)</w:t>
+        <w:t xml:space="preserve">[Power W] — laser source power in watts, e.g. 4000 = 4kW (omitted when referring to a diameter tier generically, e.g. “TDC-160”)</w:t>
       </w:r>
     </w:p>
     <w:p>
@@ -874,7 +874,7 @@
         <w:spacing w:after="160"/>
       </w:pPr>
       <w:r>
-        <w:t xml:space="preserve">Example: WV-T2-160-4000 = double-chuck, 160mm max diameter, 4,000W configuration.</w:t>
+        <w:t xml:space="preserve">Example: TDC-160-4000 = TubeCut Double Chuck, 160mm max diameter, 4,000W configuration.</w:t>
       </w:r>
     </w:p>
     <w:p>
@@ -882,7 +882,7 @@
         <w:pStyle w:val="Heading1"/>
       </w:pPr>
       <w:r>
-        <w:t xml:space="preserve">3. WV-T2 Series — Double Chuck (Entry &amp; Intermediate)</w:t>
+        <w:t xml:space="preserve">3. TubeCut Double Chuck Series (Entry &amp; Intermediate)</w:t>
       </w:r>
     </w:p>
     <w:p>
@@ -1192,7 +1192,7 @@
                 <w:sz w:val="20"/>
                 <w:szCs w:val="20"/>
               </w:rPr>
-              <w:t xml:space="preserve">WV-T2-120</w:t>
+              <w:t xml:space="preserve">TDC-120</w:t>
             </w:r>
           </w:p>
         </w:tc>
@@ -1426,7 +1426,7 @@
                 <w:sz w:val="20"/>
                 <w:szCs w:val="20"/>
               </w:rPr>
-              <w:t xml:space="preserve">WV-T2-160</w:t>
+              <w:t xml:space="preserve">TDC-160</w:t>
             </w:r>
           </w:p>
         </w:tc>
@@ -1665,7 +1665,7 @@
                 <w:sz w:val="20"/>
                 <w:szCs w:val="20"/>
               </w:rPr>
-              <w:t xml:space="preserve">WV-T2-240</w:t>
+              <w:t xml:space="preserve">TDC-240</w:t>
             </w:r>
           </w:p>
         </w:tc>
@@ -1899,7 +1899,7 @@
                 <w:sz w:val="20"/>
                 <w:szCs w:val="20"/>
               </w:rPr>
-              <w:t xml:space="preserve">WV-T2-360</w:t>
+              <w:t xml:space="preserve">TDC-360</w:t>
             </w:r>
           </w:p>
         </w:tc>
@@ -2201,7 +2201,7 @@
                 <w:sz w:val="19"/>
                 <w:szCs w:val="19"/>
               </w:rPr>
-              <w:t xml:space="preserve">WV-T2-120</w:t>
+              <w:t xml:space="preserve">TDC-120</w:t>
             </w:r>
           </w:p>
         </w:tc>
@@ -2235,7 +2235,7 @@
                 <w:sz w:val="19"/>
                 <w:szCs w:val="19"/>
               </w:rPr>
-              <w:t xml:space="preserve">WV-T2-160</w:t>
+              <w:t xml:space="preserve">TDC-160</w:t>
             </w:r>
           </w:p>
         </w:tc>
@@ -2269,7 +2269,7 @@
                 <w:sz w:val="19"/>
                 <w:szCs w:val="19"/>
               </w:rPr>
-              <w:t xml:space="preserve">WV-T2-240</w:t>
+              <w:t xml:space="preserve">TDC-240</w:t>
             </w:r>
           </w:p>
         </w:tc>
@@ -2303,7 +2303,7 @@
                 <w:sz w:val="19"/>
                 <w:szCs w:val="19"/>
               </w:rPr>
-              <w:t xml:space="preserve">WV-T2-360</w:t>
+              <w:t xml:space="preserve">TDC-360</w:t>
             </w:r>
           </w:p>
         </w:tc>
@@ -3685,7 +3685,7 @@
         <w:pStyle w:val="Heading3"/>
       </w:pPr>
       <w:r>
-        <w:t xml:space="preserve">3.3 Entry Tier — WV-T2-120 / WV-T2-160</w:t>
+        <w:t xml:space="preserve">3.3 Entry Tier — TDC-120 / TDC-160</w:t>
       </w:r>
     </w:p>
     <w:p>
@@ -3701,7 +3701,7 @@
         <w:pStyle w:val="Heading3"/>
       </w:pPr>
       <w:r>
-        <w:t xml:space="preserve">3.4 Intermediate Tier — WV-T2-240 / WV-T2-360</w:t>
+        <w:t xml:space="preserve">3.4 Intermediate Tier — TDC-240 / TDC-360</w:t>
       </w:r>
     </w:p>
     <w:p>
@@ -3709,7 +3709,7 @@
         <w:spacing w:after="160"/>
       </w:pPr>
       <w:r>
-        <w:t xml:space="preserve">Targets growing fabrication shops needing larger diameter capacity and higher throughput. WV-T2-240 and WV-T2-360 are the most frequently quoted configurations in this family, balancing diameter capacity against machine footprint and price.</w:t>
+        <w:t xml:space="preserve">Targets growing fabrication shops needing larger diameter capacity and higher throughput. TDC-240 and TDC-360 are the most frequently quoted configurations in this series, balancing diameter capacity against machine footprint and price.</w:t>
       </w:r>
     </w:p>
     <w:p>
@@ -3717,7 +3717,7 @@
         <w:pStyle w:val="Heading1"/>
       </w:pPr>
       <w:r>
-        <w:t xml:space="preserve">4. WV-T3 Series — Triple Chuck Heavy Duty</w:t>
+        <w:t xml:space="preserve">4. TubeCut Triple Chuck Series (Heavy Duty)</w:t>
       </w:r>
     </w:p>
     <w:p>
@@ -4027,7 +4027,7 @@
                 <w:sz w:val="20"/>
                 <w:szCs w:val="20"/>
               </w:rPr>
-              <w:t xml:space="preserve">WV-T3-360</w:t>
+              <w:t xml:space="preserve">TTC-360</w:t>
             </w:r>
           </w:p>
         </w:tc>
@@ -4261,7 +4261,7 @@
                 <w:sz w:val="20"/>
                 <w:szCs w:val="20"/>
               </w:rPr>
-              <w:t xml:space="preserve">WV-T3-520</w:t>
+              <w:t xml:space="preserve">TTC-520</w:t>
             </w:r>
           </w:p>
         </w:tc>
@@ -4500,7 +4500,7 @@
                 <w:sz w:val="20"/>
                 <w:szCs w:val="20"/>
               </w:rPr>
-              <w:t xml:space="preserve">WV-T3-680</w:t>
+              <w:t xml:space="preserve">TTC-680</w:t>
             </w:r>
           </w:p>
         </w:tc>
@@ -4795,7 +4795,7 @@
                 <w:sz w:val="19"/>
                 <w:szCs w:val="19"/>
               </w:rPr>
-              <w:t xml:space="preserve">WV-T3-360</w:t>
+              <w:t xml:space="preserve">TTC-360</w:t>
             </w:r>
           </w:p>
         </w:tc>
@@ -4829,7 +4829,7 @@
                 <w:sz w:val="19"/>
                 <w:szCs w:val="19"/>
               </w:rPr>
-              <w:t xml:space="preserve">WV-T3-520</w:t>
+              <w:t xml:space="preserve">TTC-520</w:t>
             </w:r>
           </w:p>
         </w:tc>
@@ -4863,7 +4863,7 @@
                 <w:sz w:val="19"/>
                 <w:szCs w:val="19"/>
               </w:rPr>
-              <w:t xml:space="preserve">WV-T3-680 / 570</w:t>
+              <w:t xml:space="preserve">TTC-680 / 570</w:t>
             </w:r>
           </w:p>
         </w:tc>
@@ -5831,7 +5831,7 @@
           <w:sz w:val="19"/>
           <w:szCs w:val="19"/>
         </w:rPr>
-        <w:t xml:space="preserve">† All WV-T3 dimensional/weight/acceleration figures are indicative engineering estimates pending confirmation — no Wavlon/LD source datasheet exists yet for the triple-chuck heavy duty tier at the time of writing.</w:t>
+        <w:t xml:space="preserve">† All TubeCut Triple Chuck dimensional/weight/acceleration figures are indicative engineering estimates pending confirmation — no Wavlon/LD source datasheet exists yet for the triple-chuck heavy duty tier at the time of writing.</w:t>
       </w:r>
     </w:p>
     <w:p>
@@ -5839,7 +5839,7 @@
         <w:pStyle w:val="Heading3"/>
       </w:pPr>
       <w:r>
-        <w:t xml:space="preserve">4.3 Heavy Duty Tier — WV-T3-360 / WV-T3-520</w:t>
+        <w:t xml:space="preserve">4.3 Heavy Duty Tier — TTC-360 / TTC-520</w:t>
       </w:r>
     </w:p>
     <w:p>
@@ -5855,7 +5855,7 @@
         <w:pStyle w:val="Heading3"/>
       </w:pPr>
       <w:r>
-        <w:t xml:space="preserve">4.4 Maximum Capacity Tier — WV-T3-680 (Round) / WV-T3-570 (Square)</w:t>
+        <w:t xml:space="preserve">4.4 Maximum Capacity Tier — TTC-680 (Round) / TTC-570 (Square)</w:t>
       </w:r>
     </w:p>
     <w:p>
@@ -5894,7 +5894,7 @@
         <w:spacing w:after="160"/>
       </w:pPr>
       <w:r>
-        <w:t xml:space="preserve">Applies across the full WV-T2 and WV-T3 line-up unless a specific model calls for a substitution (e.g., higher-capacity chillers or reducers at the 30kW tier).</w:t>
+        <w:t xml:space="preserve">Applies across the full TubeCut Double Chuck and TubeCut Triple Chuck line-up unless a specific model calls for a substitution (e.g., higher-capacity chillers or reducers at the 30kW tier).</w:t>
       </w:r>
     </w:p>
     <w:tbl>
@@ -7884,7 +7884,7 @@
                 <w:sz w:val="20"/>
                 <w:szCs w:val="20"/>
               </w:rPr>
-              <w:t xml:space="preserve">Semi-Auto (WV-T2) / Full-Auto Pneumatic Roller (WV-T3)</w:t>
+              <w:t xml:space="preserve">Semi-Auto (TubeCut Double Chuck) / Full-Auto Pneumatic Roller (TubeCut Triple Chuck)</w:t>
             </w:r>
           </w:p>
         </w:tc>
@@ -7986,7 +7986,7 @@
         <w:spacing w:after="160"/>
       </w:pPr>
       <w:r>
-        <w:t xml:space="preserve">Maps each Wavlon model to its closest LD Laser catalog equivalent for engineering and sourcing traceability.</w:t>
+        <w:t xml:space="preserve">Maps each Wavlon TubeCut model to its closest LD Laser catalog equivalent for engineering and sourcing traceability.</w:t>
       </w:r>
     </w:p>
     <w:tbl>
@@ -8245,7 +8245,7 @@
                 <w:sz w:val="20"/>
                 <w:szCs w:val="20"/>
               </w:rPr>
-              <w:t xml:space="preserve">WV-T2-120</w:t>
+              <w:t xml:space="preserve">TDC-120</w:t>
             </w:r>
           </w:p>
         </w:tc>
@@ -8446,7 +8446,7 @@
                 <w:sz w:val="20"/>
                 <w:szCs w:val="20"/>
               </w:rPr>
-              <w:t xml:space="preserve">WV-T2-160</w:t>
+              <w:t xml:space="preserve">TDC-160</w:t>
             </w:r>
           </w:p>
         </w:tc>
@@ -8651,7 +8651,7 @@
                 <w:sz w:val="20"/>
                 <w:szCs w:val="20"/>
               </w:rPr>
-              <w:t xml:space="preserve">WV-T2-240</w:t>
+              <w:t xml:space="preserve">TDC-240</w:t>
             </w:r>
           </w:p>
         </w:tc>
@@ -8852,7 +8852,7 @@
                 <w:sz w:val="20"/>
                 <w:szCs w:val="20"/>
               </w:rPr>
-              <w:t xml:space="preserve">WV-T2-360</w:t>
+              <w:t xml:space="preserve">TDC-360</w:t>
             </w:r>
           </w:p>
         </w:tc>
@@ -9057,7 +9057,7 @@
                 <w:sz w:val="20"/>
                 <w:szCs w:val="20"/>
               </w:rPr>
-              <w:t xml:space="preserve">WV-T3-360</w:t>
+              <w:t xml:space="preserve">TTC-360</w:t>
             </w:r>
           </w:p>
         </w:tc>
@@ -9258,7 +9258,7 @@
                 <w:sz w:val="20"/>
                 <w:szCs w:val="20"/>
               </w:rPr>
-              <w:t xml:space="preserve">WV-T3-520</w:t>
+              <w:t xml:space="preserve">TTC-520</w:t>
             </w:r>
           </w:p>
         </w:tc>
@@ -9463,7 +9463,7 @@
                 <w:sz w:val="20"/>
                 <w:szCs w:val="20"/>
               </w:rPr>
-              <w:t xml:space="preserve">WV-T3-680/570</w:t>
+              <w:t xml:space="preserve">TTC-680/570</w:t>
             </w:r>
           </w:p>
         </w:tc>
@@ -9647,7 +9647,7 @@
         <w:spacing w:after="160"/>
       </w:pPr>
       <w:r>
-        <w:t xml:space="preserve">Adapted from the LD Laser reference installation guidelines; applies to all WV-T2 and WV-T3 models.</w:t>
+        <w:t xml:space="preserve">Adapted from the LD Laser reference installation guidelines; applies to all TubeCut Double Chuck and TubeCut Triple Chuck models.</w:t>
       </w:r>
     </w:p>
     <w:p>
@@ -9772,7 +9772,7 @@
         <w:spacing w:after="80"/>
       </w:pPr>
       <w:r>
-        <w:t xml:space="preserve">Power tier options (e.g., 1.5/2/3kW for WV-T2-120) are proposed groupings based on LD's stated 1.5–12kW (T5) and 6–30kW (T8) overall ranges — confirm exact discrete wattages available from the laser source supplier (Raycus/MAX) before publishing external pricing.</w:t>
+        <w:t xml:space="preserve">Power tier options (e.g., 1.5/2/3kW for TDC-120) are proposed groupings based on LD's stated 1.5–12kW (T5) and 6–30kW (T8) overall ranges — confirm exact discrete wattages available from the laser source supplier (Raycus/MAX) before publishing external pricing.</w:t>
       </w:r>
     </w:p>
     <w:p>
@@ -9785,7 +9785,7 @@
         <w:spacing w:after="80"/>
       </w:pPr>
       <w:r>
-        <w:t xml:space="preserve">Acceleration figure for WV-T3 (≈1.0G) is an engineering estimate; LD's published T8 catalog page did not display a numeric acceleration figure at the time of extraction — confirm with supplier.</w:t>
+        <w:t xml:space="preserve">Acceleration figure for TubeCut Triple Chuck (≈1.0G) is an engineering estimate; LD's published T8 catalog page did not display a numeric acceleration figure at the time of extraction — confirm with supplier.</w:t>
       </w:r>
     </w:p>
     <w:p>
@@ -9798,7 +9798,7 @@
         <w:spacing w:after="80"/>
       </w:pPr>
       <w:r>
-        <w:t xml:space="preserve">Machine footprint and gross weight for all models except WV-T2-120 are scaled estimates from the single grounded LD/Wavlon reference datasheet (S5-6012-3000W) — treat as indicative only until confirmed.</w:t>
+        <w:t xml:space="preserve">Machine footprint and gross weight for all models except TDC-120 are scaled estimates from the single grounded LD/Wavlon reference datasheet (S5-6012-3000W) — treat as indicative only until confirmed.</w:t>
       </w:r>
     </w:p>
     <w:p>
@@ -9811,7 +9811,7 @@
         <w:spacing w:after="80"/>
       </w:pPr>
       <w:r>
-        <w:t xml:space="preserve">WV-T3-680/570 flagship diameter was specified directly by Wavlon management and is a custom target that does not exactly match any single LD T8 catalog code — see Section 4.4.</w:t>
+        <w:t xml:space="preserve">TTC-680/570 flagship diameter was specified directly by Wavlon management and is a custom target that does not exactly match any single LD T8 catalog code — see Section 4.4.</w:t>
       </w:r>
     </w:p>
     <w:p>
@@ -9997,7 +9997,7 @@
         <w:sz w:val="16"/>
         <w:szCs w:val="16"/>
       </w:rPr>
-      <w:t xml:space="preserve">WAVLON LASERS — TUBE LASER SERIES REFERENCE</w:t>
+      <w:t xml:space="preserve">WAVLON LASERS — TUBECUT SERIES REFERENCE</w:t>
     </w:r>
   </w:p>
 </w:hdr>

</xml_diff>